<commit_message>
documents and document templates for TravelEntries #5845 (#6582)
* documents and document templates for TravelEntries #5845

* rename string property #5845
</commit_message>
<xml_diff>
--- a/sormas-ui/src/main/resources/SORMAS_Document_Template_Guide.docx
+++ b/sormas-ui/src/main/resources/SORMAS_Document_Template_Guide.docx
@@ -3815,6 +3815,172 @@
           <w:lang w:val="en-US"/>
         </w:rPr>
         <w:t xml:space="preserve"> (selectable)</w:t>
+      </w:r>
+    </w:p>
+    <w:p>
+      <w:pPr>
+        <w:shd w:val="clear" w:color="auto" w:fill="FFFFFF" w:themeFill="background1"/>
+        <w:rPr>
+          <w:lang w:val="en-US"/>
+        </w:rPr>
+      </w:pPr>
+    </w:p>
+    <w:p>
+      <w:pPr>
+        <w:pStyle w:val="Listenabsatz"/>
+        <w:numPr>
+          <w:ilvl w:val="0"/>
+          <w:numId w:val="9"/>
+        </w:numPr>
+        <w:shd w:val="clear" w:color="auto" w:fill="FFFFFF" w:themeFill="background1"/>
+        <w:rPr>
+          <w:b/>
+          <w:lang w:val="en-US"/>
+        </w:rPr>
+      </w:pPr>
+      <w:r>
+        <w:rPr>
+          <w:b/>
+          <w:lang w:val="en-US"/>
+        </w:rPr>
+        <w:t>Templates for Travel Entries</w:t>
+      </w:r>
+      <w:r>
+        <w:rPr>
+          <w:b/>
+          <w:lang w:val="en-US"/>
+        </w:rPr>
+        <w:t xml:space="preserve"> (.</w:t>
+      </w:r>
+      <w:proofErr w:type="spellStart"/>
+      <w:r>
+        <w:rPr>
+          <w:b/>
+          <w:lang w:val="en-US"/>
+        </w:rPr>
+        <w:t>docx</w:t>
+      </w:r>
+      <w:proofErr w:type="spellEnd"/>
+      <w:r>
+        <w:rPr>
+          <w:b/>
+          <w:lang w:val="en-US"/>
+        </w:rPr>
+        <w:t>):</w:t>
+      </w:r>
+      <w:r>
+        <w:rPr>
+          <w:b/>
+          <w:lang w:val="en-US"/>
+        </w:rPr>
+        <w:br/>
+      </w:r>
+      <w:r>
+        <w:rPr>
+          <w:lang w:val="en-US"/>
+        </w:rPr>
+        <w:t>Available root entities:</w:t>
+      </w:r>
+      <w:r>
+        <w:rPr>
+          <w:b/>
+          <w:lang w:val="en-US"/>
+        </w:rPr>
+        <w:t xml:space="preserve"> </w:t>
+      </w:r>
+    </w:p>
+    <w:p>
+      <w:pPr>
+        <w:pStyle w:val="Listenabsatz"/>
+        <w:numPr>
+          <w:ilvl w:val="0"/>
+          <w:numId w:val="11"/>
+        </w:numPr>
+        <w:shd w:val="clear" w:color="auto" w:fill="FFFFFF" w:themeFill="background1"/>
+        <w:rPr>
+          <w:lang w:val="en-US"/>
+        </w:rPr>
+      </w:pPr>
+      <w:proofErr w:type="spellStart"/>
+      <w:r>
+        <w:rPr>
+          <w:b/>
+          <w:lang w:val="en-US"/>
+        </w:rPr>
+        <w:t>travelEntry</w:t>
+      </w:r>
+      <w:proofErr w:type="spellEnd"/>
+      <w:r>
+        <w:rPr>
+          <w:lang w:val="en-US"/>
+        </w:rPr>
+        <w:t xml:space="preserve">: </w:t>
+      </w:r>
+      <w:proofErr w:type="spellStart"/>
+      <w:r>
+        <w:rPr>
+          <w:lang w:val="en-US"/>
+        </w:rPr>
+        <w:t>travelEntry</w:t>
+      </w:r>
+      <w:proofErr w:type="spellEnd"/>
+      <w:r>
+        <w:rPr>
+          <w:lang w:val="en-US"/>
+        </w:rPr>
+        <w:t xml:space="preserve"> data</w:t>
+      </w:r>
+    </w:p>
+    <w:p>
+      <w:pPr>
+        <w:pStyle w:val="Listenabsatz"/>
+        <w:numPr>
+          <w:ilvl w:val="0"/>
+          <w:numId w:val="11"/>
+        </w:numPr>
+        <w:shd w:val="clear" w:color="auto" w:fill="FFFFFF" w:themeFill="background1"/>
+        <w:rPr>
+          <w:lang w:val="en-US"/>
+        </w:rPr>
+      </w:pPr>
+      <w:r>
+        <w:rPr>
+          <w:b/>
+          <w:lang w:val="en-US"/>
+        </w:rPr>
+        <w:t>person</w:t>
+      </w:r>
+      <w:r>
+        <w:rPr>
+          <w:lang w:val="en-US"/>
+        </w:rPr>
+        <w:t>: the travelEntry person</w:t>
+      </w:r>
+    </w:p>
+    <w:p>
+      <w:pPr>
+        <w:pStyle w:val="Listenabsatz"/>
+        <w:numPr>
+          <w:ilvl w:val="0"/>
+          <w:numId w:val="11"/>
+        </w:numPr>
+        <w:shd w:val="clear" w:color="auto" w:fill="FFFFFF" w:themeFill="background1"/>
+        <w:rPr>
+          <w:lang w:val="en-US"/>
+        </w:rPr>
+      </w:pPr>
+      <w:r>
+        <w:rPr>
+          <w:b/>
+          <w:lang w:val="en-US"/>
+        </w:rPr>
+        <w:t>user</w:t>
+      </w:r>
+      <w:r>
+        <w:rPr>
+          <w:lang w:val="en-US"/>
+        </w:rPr>
+        <w:t>: the current user</w:t>
       </w:r>
     </w:p>
     <w:p>

</xml_diff>